<commit_message>
Deploy: Commission report enhancements + server deployment
- Added Group By toggle (Client/Individual) to Quarterly Commission report
- Fixed Excel export for both grouping modes
- Added 'Include commission lines with no payment' checkbox
- Added deploy.sh for Python/FastAPI server deployment via PM2
- Added sqlalchemy, psycopg2-binary, python-multipart to requirements.txt
- Updated backend commission API with include_no_payment parameter
</commit_message>
<xml_diff>
--- a/Design Notes /Orders Backlog.docx
+++ b/Design Notes /Orders Backlog.docx
@@ -304,10 +304,7 @@
         </w:numPr>
       </w:pPr>
       <w:r>
-        <w:t>Others</w:t>
-      </w:r>
-      <w:r>
-        <w:t xml:space="preserve"> </w:t>
+        <w:t xml:space="preserve">Others </w:t>
       </w:r>
     </w:p>
     <w:p>
@@ -544,13 +541,7 @@
         </w:numPr>
       </w:pPr>
       <w:r>
-        <w:t xml:space="preserve">Milestone </w:t>
-      </w:r>
-      <w:r>
-        <w:t xml:space="preserve">Scheduled Date </w:t>
-      </w:r>
-      <w:r>
-        <w:t xml:space="preserve"> </w:t>
+        <w:t xml:space="preserve">Milestone Scheduled Date  </w:t>
       </w:r>
     </w:p>
     <w:p>
@@ -640,10 +631,7 @@
         </w:numPr>
       </w:pPr>
       <w:r>
-        <w:t xml:space="preserve">Difference </w:t>
-      </w:r>
-      <w:r>
-        <w:t xml:space="preserve">of total Milestone payment and Contract Amount which checks accuracy of Milestone total match the contract </w:t>
+        <w:t xml:space="preserve">Difference of total Milestone payment and Contract Amount which checks accuracy of Milestone total match the contract </w:t>
       </w:r>
     </w:p>
     <w:p>
@@ -718,10 +706,7 @@
         </w:numPr>
       </w:pPr>
       <w:r>
-        <w:t xml:space="preserve">Milestone (pill down) </w:t>
-      </w:r>
-      <w:r>
-        <w:t>(Milestone Name, Milestone Description)</w:t>
+        <w:t>Milestone (pill down) (Milestone Name, Milestone Description)</w:t>
       </w:r>
     </w:p>
     <w:p>
@@ -1003,15 +988,7 @@
         </w:numPr>
       </w:pPr>
       <w:r>
-        <w:t xml:space="preserve">Admin may edit the orders milestones, add new milestone, change value of </w:t>
-      </w:r>
-      <w:proofErr w:type="gramStart"/>
-      <w:r>
-        <w:t>milestone</w:t>
-      </w:r>
-      <w:proofErr w:type="gramEnd"/>
-      <w:r>
-        <w:t xml:space="preserve"> at any time.  System needs to keep track of the changes, notes reason for changes </w:t>
+        <w:t xml:space="preserve">Admin may edit the orders milestones, add new milestone, change value of milestone at any time.  System needs to keep track of the changes, notes reason for changes </w:t>
       </w:r>
     </w:p>
     <w:p>

</xml_diff>